<commit_message>
Mise à jour fiche RP
</commit_message>
<xml_diff>
--- a/7- Annexes 7 - Epreuve E5 - BTS SIO 2026-2.docx
+++ b/7- Annexes 7 - Epreuve E5 - BTS SIO 2026-2.docx
@@ -3881,6 +3881,7 @@
               <w:t>Organisation support de la réalisation professionnelle</w:t>
             </w:r>
           </w:p>
+          <w:p/>
           <w:p>
             <w:pPr>
               <w:rPr>
@@ -3895,6 +3896,14 @@
               </w:rPr>
               <w:t>Mediaschool / IRIS Nice</w:t>
             </w:r>
+          </w:p>
+          <w:p>
+            <w:pPr>
+              <w:rPr>
+                <w:rFonts w:ascii="Arial" w:hAnsi="Arial" w:cs="Arial"/>
+                <w:sz w:val="20"/>
+              </w:rPr>
+            </w:pPr>
           </w:p>
         </w:tc>
       </w:tr>
@@ -3961,6 +3970,7 @@
               <w:t xml:space="preserve">  </w:t>
             </w:r>
           </w:p>
+          <w:p/>
           <w:p>
             <w:pPr>
               <w:pStyle w:val="Titre9"/>
@@ -3972,17 +3982,19 @@
               <w:rPr>
                 <w:bCs/>
                 <w:sz w:val="20"/>
-              </w:rPr>
-            </w:pPr>
-            <w:r>
-              <w:rPr>
-                <w:bCs/>
-                <w:sz w:val="20"/>
                 <w:szCs w:val="24"/>
               </w:rPr>
+            </w:pPr>
+            <w:r>
+              <w:rPr>
+                <w:bCs/>
+                <w:sz w:val="20"/>
+                <w:szCs w:val="24"/>
+              </w:rPr>
               <w:t>Configuration de Grafana, Prometheus et Dokuwiki via Traefik</w:t>
             </w:r>
           </w:p>
+          <w:p/>
         </w:tc>
       </w:tr>
       <w:tr>
@@ -4595,6 +4607,17 @@
               <w:jc w:val="both"/>
               <w:rPr>
                 <w:rFonts w:ascii="Arial" w:hAnsi="Arial" w:cs="Arial"/>
+                <w:b/>
+                <w:sz w:val="20"/>
+              </w:rPr>
+            </w:pPr>
+          </w:p>
+          <w:p>
+            <w:pPr>
+              <w:snapToGrid w:val="0"/>
+              <w:jc w:val="both"/>
+              <w:rPr>
+                <w:rFonts w:ascii="Arial" w:hAnsi="Arial" w:cs="Arial"/>
                 <w:bCs/>
                 <w:sz w:val="20"/>
               </w:rPr>
@@ -4607,6 +4630,17 @@
               </w:rPr>
               <w:t>L’infrastructure réseau de l’école et Active Directory ont déjà été installés. Il est désormais attendu d’installer des services (Grafana, Prometheus, Dokuwiki) via un point d’accès central grâce au reverse proxy Traefik.</w:t>
             </w:r>
+          </w:p>
+          <w:p>
+            <w:pPr>
+              <w:snapToGrid w:val="0"/>
+              <w:jc w:val="both"/>
+              <w:rPr>
+                <w:rFonts w:ascii="Arial" w:hAnsi="Arial" w:cs="Arial"/>
+                <w:bCs/>
+                <w:sz w:val="20"/>
+              </w:rPr>
+            </w:pPr>
           </w:p>
         </w:tc>
       </w:tr>
@@ -4684,50 +4718,10 @@
               <w:jc w:val="both"/>
               <w:rPr>
                 <w:rFonts w:ascii="Arial" w:hAnsi="Arial" w:cs="Arial"/>
-                <w:bCs/>
-                <w:sz w:val="20"/>
-              </w:rPr>
-            </w:pPr>
-            <w:r>
-              <w:rPr>
-                <w:rFonts w:ascii="Arial" w:hAnsi="Arial" w:cs="Arial"/>
-                <w:bCs/>
-                <w:sz w:val="20"/>
-              </w:rPr>
-              <w:t>Documentation internet pour co</w:t>
-            </w:r>
-            <w:r>
-              <w:rPr>
-                <w:rFonts w:ascii="Arial" w:hAnsi="Arial" w:cs="Arial"/>
-                <w:bCs/>
-                <w:sz w:val="20"/>
-              </w:rPr>
-              <w:t>mprendre le fonctionnement des différents services (installation et accès à Traefik, Grafana</w:t>
-            </w:r>
-            <w:r>
-              <w:rPr>
-                <w:rFonts w:ascii="Arial" w:hAnsi="Arial" w:cs="Arial"/>
-                <w:bCs/>
-                <w:sz w:val="20"/>
-              </w:rPr>
-              <w:t>,</w:t>
-            </w:r>
-            <w:r>
-              <w:rPr>
-                <w:rFonts w:ascii="Arial" w:hAnsi="Arial" w:cs="Arial"/>
-                <w:bCs/>
-                <w:sz w:val="20"/>
-              </w:rPr>
-              <w:t xml:space="preserve"> Prometheus, Dokuwiki)</w:t>
-            </w:r>
-            <w:r>
-              <w:rPr>
-                <w:rFonts w:ascii="Arial" w:hAnsi="Arial" w:cs="Arial"/>
-                <w:bCs/>
-                <w:sz w:val="20"/>
-              </w:rPr>
-              <w:t>.</w:t>
-            </w:r>
+                <w:b/>
+                <w:sz w:val="20"/>
+              </w:rPr>
+            </w:pPr>
           </w:p>
           <w:p>
             <w:pPr>
@@ -4745,7 +4739,31 @@
                 <w:bCs/>
                 <w:sz w:val="20"/>
               </w:rPr>
-              <w:t>IT-connect pour installer sudo et me connecter en ssh</w:t>
+              <w:t>Documentation internet pour co</w:t>
+            </w:r>
+            <w:r>
+              <w:rPr>
+                <w:rFonts w:ascii="Arial" w:hAnsi="Arial" w:cs="Arial"/>
+                <w:bCs/>
+                <w:sz w:val="20"/>
+              </w:rPr>
+              <w:t>mprendre le fonctionnement des différents services (installation et accès à Traefik, Grafana</w:t>
+            </w:r>
+            <w:r>
+              <w:rPr>
+                <w:rFonts w:ascii="Arial" w:hAnsi="Arial" w:cs="Arial"/>
+                <w:bCs/>
+                <w:sz w:val="20"/>
+              </w:rPr>
+              <w:t>,</w:t>
+            </w:r>
+            <w:r>
+              <w:rPr>
+                <w:rFonts w:ascii="Arial" w:hAnsi="Arial" w:cs="Arial"/>
+                <w:bCs/>
+                <w:sz w:val="20"/>
+              </w:rPr>
+              <w:t xml:space="preserve"> Prometheus, Dokuwiki)</w:t>
             </w:r>
             <w:r>
               <w:rPr>
@@ -4772,71 +4790,15 @@
                 <w:bCs/>
                 <w:sz w:val="20"/>
               </w:rPr>
-              <w:t>docs.docker.c</w:t>
-            </w:r>
-            <w:r>
-              <w:rPr>
-                <w:rFonts w:ascii="Arial" w:hAnsi="Arial" w:cs="Arial"/>
-                <w:bCs/>
-                <w:sz w:val="20"/>
-              </w:rPr>
-              <w:t xml:space="preserve">om pour installer </w:t>
-            </w:r>
-            <w:r>
-              <w:rPr>
-                <w:rFonts w:ascii="Arial" w:hAnsi="Arial" w:cs="Arial"/>
-                <w:bCs/>
-                <w:sz w:val="20"/>
-              </w:rPr>
-              <w:t>D</w:t>
-            </w:r>
-            <w:r>
-              <w:rPr>
-                <w:rFonts w:ascii="Arial" w:hAnsi="Arial" w:cs="Arial"/>
-                <w:bCs/>
-                <w:sz w:val="20"/>
-              </w:rPr>
-              <w:t xml:space="preserve">ocker et </w:t>
-            </w:r>
-            <w:r>
-              <w:rPr>
-                <w:rFonts w:ascii="Arial" w:hAnsi="Arial" w:cs="Arial"/>
-                <w:bCs/>
-                <w:sz w:val="20"/>
-              </w:rPr>
-              <w:t>D</w:t>
-            </w:r>
-            <w:r>
-              <w:rPr>
-                <w:rFonts w:ascii="Arial" w:hAnsi="Arial" w:cs="Arial"/>
-                <w:bCs/>
-                <w:sz w:val="20"/>
-              </w:rPr>
-              <w:t xml:space="preserve">ocker </w:t>
-            </w:r>
-            <w:r>
-              <w:rPr>
-                <w:rFonts w:ascii="Arial" w:hAnsi="Arial" w:cs="Arial"/>
-                <w:bCs/>
-                <w:sz w:val="20"/>
-              </w:rPr>
-              <w:t>C</w:t>
-            </w:r>
-            <w:r>
-              <w:rPr>
-                <w:rFonts w:ascii="Arial" w:hAnsi="Arial" w:cs="Arial"/>
-                <w:bCs/>
-                <w:sz w:val="20"/>
-              </w:rPr>
-              <w:t>ompos</w:t>
-            </w:r>
-            <w:r>
-              <w:rPr>
-                <w:rFonts w:ascii="Arial" w:hAnsi="Arial" w:cs="Arial"/>
-                <w:bCs/>
-                <w:sz w:val="20"/>
-              </w:rPr>
-              <w:t>e.</w:t>
+              <w:t>IT-connect pour installer sudo et me connecter en ssh</w:t>
+            </w:r>
+            <w:r>
+              <w:rPr>
+                <w:rFonts w:ascii="Arial" w:hAnsi="Arial" w:cs="Arial"/>
+                <w:bCs/>
+                <w:sz w:val="20"/>
+              </w:rPr>
+              <w:t>.</w:t>
             </w:r>
           </w:p>
           <w:p>
@@ -4855,7 +4817,71 @@
                 <w:bCs/>
                 <w:sz w:val="20"/>
               </w:rPr>
-              <w:t>Exploitation de l'IA comme assistant de veille et de recherche, mobilisé pour approfondir certaines notions et surmonter les obstacles techniques, avec validation croisée des informations.</w:t>
+              <w:t>docs.docker.c</w:t>
+            </w:r>
+            <w:r>
+              <w:rPr>
+                <w:rFonts w:ascii="Arial" w:hAnsi="Arial" w:cs="Arial"/>
+                <w:bCs/>
+                <w:sz w:val="20"/>
+              </w:rPr>
+              <w:t xml:space="preserve">om pour installer </w:t>
+            </w:r>
+            <w:r>
+              <w:rPr>
+                <w:rFonts w:ascii="Arial" w:hAnsi="Arial" w:cs="Arial"/>
+                <w:bCs/>
+                <w:sz w:val="20"/>
+              </w:rPr>
+              <w:t>D</w:t>
+            </w:r>
+            <w:r>
+              <w:rPr>
+                <w:rFonts w:ascii="Arial" w:hAnsi="Arial" w:cs="Arial"/>
+                <w:bCs/>
+                <w:sz w:val="20"/>
+              </w:rPr>
+              <w:t xml:space="preserve">ocker et </w:t>
+            </w:r>
+            <w:r>
+              <w:rPr>
+                <w:rFonts w:ascii="Arial" w:hAnsi="Arial" w:cs="Arial"/>
+                <w:bCs/>
+                <w:sz w:val="20"/>
+              </w:rPr>
+              <w:t>D</w:t>
+            </w:r>
+            <w:r>
+              <w:rPr>
+                <w:rFonts w:ascii="Arial" w:hAnsi="Arial" w:cs="Arial"/>
+                <w:bCs/>
+                <w:sz w:val="20"/>
+              </w:rPr>
+              <w:t xml:space="preserve">ocker </w:t>
+            </w:r>
+            <w:r>
+              <w:rPr>
+                <w:rFonts w:ascii="Arial" w:hAnsi="Arial" w:cs="Arial"/>
+                <w:bCs/>
+                <w:sz w:val="20"/>
+              </w:rPr>
+              <w:t>C</w:t>
+            </w:r>
+            <w:r>
+              <w:rPr>
+                <w:rFonts w:ascii="Arial" w:hAnsi="Arial" w:cs="Arial"/>
+                <w:bCs/>
+                <w:sz w:val="20"/>
+              </w:rPr>
+              <w:t>ompos</w:t>
+            </w:r>
+            <w:r>
+              <w:rPr>
+                <w:rFonts w:ascii="Arial" w:hAnsi="Arial" w:cs="Arial"/>
+                <w:bCs/>
+                <w:sz w:val="20"/>
+              </w:rPr>
+              <w:t>e.</w:t>
             </w:r>
           </w:p>
           <w:p>
@@ -4874,87 +4900,7 @@
                 <w:bCs/>
                 <w:sz w:val="20"/>
               </w:rPr>
-              <w:t>Hyperviseur : VMWare Workstation 17 Pro</w:t>
-            </w:r>
-            <w:r>
-              <w:rPr>
-                <w:rFonts w:ascii="Arial" w:hAnsi="Arial" w:cs="Arial"/>
-                <w:bCs/>
-                <w:sz w:val="20"/>
-              </w:rPr>
-              <w:t xml:space="preserve">, </w:t>
-            </w:r>
-            <w:r>
-              <w:rPr>
-                <w:rFonts w:ascii="Arial" w:hAnsi="Arial" w:cs="Arial"/>
-                <w:bCs/>
-                <w:sz w:val="20"/>
-              </w:rPr>
-              <w:t>1</w:t>
-            </w:r>
-            <w:r>
-              <w:rPr>
-                <w:rFonts w:ascii="Arial" w:hAnsi="Arial" w:cs="Arial"/>
-                <w:bCs/>
-                <w:sz w:val="20"/>
-              </w:rPr>
-              <w:t xml:space="preserve"> machine virtuelle</w:t>
-            </w:r>
-            <w:r>
-              <w:rPr>
-                <w:rFonts w:ascii="Arial" w:hAnsi="Arial" w:cs="Arial"/>
-                <w:bCs/>
-                <w:sz w:val="20"/>
-              </w:rPr>
-              <w:t xml:space="preserve"> </w:t>
-            </w:r>
-            <w:r>
-              <w:rPr>
-                <w:rFonts w:ascii="Arial" w:hAnsi="Arial" w:cs="Arial"/>
-                <w:bCs/>
-                <w:sz w:val="20"/>
-              </w:rPr>
-              <w:t>(VM) Debian</w:t>
-            </w:r>
-            <w:r>
-              <w:rPr>
-                <w:rFonts w:ascii="Arial" w:hAnsi="Arial" w:cs="Arial"/>
-                <w:bCs/>
-                <w:sz w:val="20"/>
-              </w:rPr>
-              <w:t xml:space="preserve"> </w:t>
-            </w:r>
-            <w:r>
-              <w:rPr>
-                <w:rFonts w:ascii="Arial" w:hAnsi="Arial" w:cs="Arial"/>
-                <w:bCs/>
-                <w:sz w:val="20"/>
-              </w:rPr>
-              <w:t>12 :</w:t>
-            </w:r>
-            <w:r>
-              <w:rPr>
-                <w:rFonts w:ascii="Arial" w:hAnsi="Arial" w:cs="Arial"/>
-                <w:bCs/>
-                <w:sz w:val="20"/>
-              </w:rPr>
-              <w:t xml:space="preserve"> </w:t>
-            </w:r>
-            <w:r>
-              <w:rPr>
-                <w:rFonts w:ascii="Arial" w:hAnsi="Arial" w:cs="Arial"/>
-                <w:bCs/>
-                <w:sz w:val="20"/>
-              </w:rPr>
-              <w:t>Services-2</w:t>
-            </w:r>
-            <w:r>
-              <w:rPr>
-                <w:rFonts w:ascii="Arial" w:hAnsi="Arial" w:cs="Arial"/>
-                <w:bCs/>
-                <w:sz w:val="20"/>
-              </w:rPr>
-              <w:t xml:space="preserve">. </w:t>
+              <w:t>Exploitation de l'IA comme assistant de veille et de recherche, mobilisé pour approfondir certaines notions et surmonter les obstacles techniques, avec validation croisée des informations.</w:t>
             </w:r>
           </w:p>
           <w:p>
@@ -4973,7 +4919,31 @@
                 <w:bCs/>
                 <w:sz w:val="20"/>
               </w:rPr>
-              <w:t>Utilisation de Webvirtcloud sur le serveur de l’école qui a pour hyperviseur KVM pour importer mes VM.</w:t>
+              <w:t>Hyperviseur : VMWare Workstation 17 Pro</w:t>
+            </w:r>
+            <w:r>
+              <w:rPr>
+                <w:rFonts w:ascii="Arial" w:hAnsi="Arial" w:cs="Arial"/>
+                <w:bCs/>
+                <w:sz w:val="20"/>
+              </w:rPr>
+              <w:t xml:space="preserve">, </w:t>
+            </w:r>
+            <w:r>
+              <w:rPr>
+                <w:rFonts w:ascii="Arial" w:hAnsi="Arial" w:cs="Arial"/>
+                <w:bCs/>
+                <w:sz w:val="20"/>
+              </w:rPr>
+              <w:t>1</w:t>
+            </w:r>
+            <w:r>
+              <w:rPr>
+                <w:rFonts w:ascii="Arial" w:hAnsi="Arial" w:cs="Arial"/>
+                <w:bCs/>
+                <w:sz w:val="20"/>
+              </w:rPr>
+              <w:t xml:space="preserve"> machine virtuelle</w:t>
             </w:r>
             <w:r>
               <w:rPr>
@@ -4982,6 +4952,54 @@
                 <w:sz w:val="20"/>
               </w:rPr>
               <w:t xml:space="preserve"> </w:t>
+            </w:r>
+            <w:r>
+              <w:rPr>
+                <w:rFonts w:ascii="Arial" w:hAnsi="Arial" w:cs="Arial"/>
+                <w:bCs/>
+                <w:sz w:val="20"/>
+              </w:rPr>
+              <w:t>(VM) Debian</w:t>
+            </w:r>
+            <w:r>
+              <w:rPr>
+                <w:rFonts w:ascii="Arial" w:hAnsi="Arial" w:cs="Arial"/>
+                <w:bCs/>
+                <w:sz w:val="20"/>
+              </w:rPr>
+              <w:t xml:space="preserve"> </w:t>
+            </w:r>
+            <w:r>
+              <w:rPr>
+                <w:rFonts w:ascii="Arial" w:hAnsi="Arial" w:cs="Arial"/>
+                <w:bCs/>
+                <w:sz w:val="20"/>
+              </w:rPr>
+              <w:t>12 :</w:t>
+            </w:r>
+            <w:r>
+              <w:rPr>
+                <w:rFonts w:ascii="Arial" w:hAnsi="Arial" w:cs="Arial"/>
+                <w:bCs/>
+                <w:sz w:val="20"/>
+              </w:rPr>
+              <w:t xml:space="preserve"> </w:t>
+            </w:r>
+            <w:r>
+              <w:rPr>
+                <w:rFonts w:ascii="Arial" w:hAnsi="Arial" w:cs="Arial"/>
+                <w:bCs/>
+                <w:sz w:val="20"/>
+              </w:rPr>
+              <w:t>Services-2</w:t>
+            </w:r>
+            <w:r>
+              <w:rPr>
+                <w:rFonts w:ascii="Arial" w:hAnsi="Arial" w:cs="Arial"/>
+                <w:bCs/>
+                <w:sz w:val="20"/>
+              </w:rPr>
+              <w:t xml:space="preserve">. </w:t>
             </w:r>
           </w:p>
           <w:p>
@@ -5000,15 +5018,7 @@
                 <w:bCs/>
                 <w:sz w:val="20"/>
               </w:rPr>
-              <w:t>WinSCP pour le transfert de fichiers.</w:t>
-            </w:r>
-            <w:r>
-              <w:rPr>
-                <w:rFonts w:ascii="Arial" w:hAnsi="Arial" w:cs="Arial"/>
-                <w:bCs/>
-                <w:sz w:val="20"/>
-              </w:rPr>
-              <w:t xml:space="preserve"> </w:t>
+              <w:t xml:space="preserve">Utilisation de Webvirtcloud sur le serveur de l’école qui a pour hyperviseur KVM pour importer mes VM. </w:t>
             </w:r>
           </w:p>
           <w:p>
@@ -5027,7 +5037,7 @@
                 <w:bCs/>
                 <w:sz w:val="20"/>
               </w:rPr>
-              <w:t>Outils</w:t>
+              <w:t>WinSCP pour le transfert de fichiers.</w:t>
             </w:r>
             <w:r>
               <w:rPr>
@@ -5036,54 +5046,6 @@
                 <w:sz w:val="20"/>
               </w:rPr>
               <w:t xml:space="preserve"> </w:t>
-            </w:r>
-            <w:r>
-              <w:rPr>
-                <w:rFonts w:ascii="Arial" w:hAnsi="Arial" w:cs="Arial"/>
-                <w:bCs/>
-                <w:sz w:val="20"/>
-              </w:rPr>
-              <w:t xml:space="preserve">utilisés : </w:t>
-            </w:r>
-            <w:r>
-              <w:rPr>
-                <w:rFonts w:ascii="Arial" w:hAnsi="Arial" w:cs="Arial"/>
-                <w:bCs/>
-                <w:sz w:val="20"/>
-              </w:rPr>
-              <w:t>Docker et Docker compose</w:t>
-            </w:r>
-            <w:r>
-              <w:rPr>
-                <w:rFonts w:ascii="Arial" w:hAnsi="Arial" w:cs="Arial"/>
-                <w:bCs/>
-                <w:sz w:val="20"/>
-              </w:rPr>
-              <w:t>, Traefik, Grafana, Prometheus</w:t>
-            </w:r>
-            <w:r>
-              <w:rPr>
-                <w:rFonts w:ascii="Arial" w:hAnsi="Arial" w:cs="Arial"/>
-                <w:bCs/>
-                <w:sz w:val="20"/>
-              </w:rPr>
-              <w:t xml:space="preserve"> et </w:t>
-            </w:r>
-            <w:r>
-              <w:rPr>
-                <w:rFonts w:ascii="Arial" w:hAnsi="Arial" w:cs="Arial"/>
-                <w:bCs/>
-                <w:sz w:val="20"/>
-              </w:rPr>
-              <w:t>Dokuwiki</w:t>
-            </w:r>
-            <w:r>
-              <w:rPr>
-                <w:rFonts w:ascii="Arial" w:hAnsi="Arial" w:cs="Arial"/>
-                <w:bCs/>
-                <w:sz w:val="20"/>
-              </w:rPr>
-              <w:t>.</w:t>
             </w:r>
           </w:p>
           <w:p>
@@ -5102,15 +5064,63 @@
                 <w:bCs/>
                 <w:sz w:val="20"/>
               </w:rPr>
-              <w:t xml:space="preserve">Modèle du serveur : </w:t>
-            </w:r>
-            <w:r>
-              <w:rPr>
-                <w:rFonts w:ascii="Arial" w:hAnsi="Arial" w:cs="Arial"/>
-                <w:bCs/>
-                <w:sz w:val="20"/>
-              </w:rPr>
-              <w:t>Dell Inc. PowerEdge R640</w:t>
+              <w:t>Outils</w:t>
+            </w:r>
+            <w:r>
+              <w:rPr>
+                <w:rFonts w:ascii="Arial" w:hAnsi="Arial" w:cs="Arial"/>
+                <w:bCs/>
+                <w:sz w:val="20"/>
+              </w:rPr>
+              <w:t xml:space="preserve"> </w:t>
+            </w:r>
+            <w:r>
+              <w:rPr>
+                <w:rFonts w:ascii="Arial" w:hAnsi="Arial" w:cs="Arial"/>
+                <w:bCs/>
+                <w:sz w:val="20"/>
+              </w:rPr>
+              <w:t xml:space="preserve">utilisés : </w:t>
+            </w:r>
+            <w:r>
+              <w:rPr>
+                <w:rFonts w:ascii="Arial" w:hAnsi="Arial" w:cs="Arial"/>
+                <w:bCs/>
+                <w:sz w:val="20"/>
+              </w:rPr>
+              <w:t>Docker et Docker compose</w:t>
+            </w:r>
+            <w:r>
+              <w:rPr>
+                <w:rFonts w:ascii="Arial" w:hAnsi="Arial" w:cs="Arial"/>
+                <w:bCs/>
+                <w:sz w:val="20"/>
+              </w:rPr>
+              <w:t>, Traefik, Grafana, Prometheus</w:t>
+            </w:r>
+            <w:r>
+              <w:rPr>
+                <w:rFonts w:ascii="Arial" w:hAnsi="Arial" w:cs="Arial"/>
+                <w:bCs/>
+                <w:sz w:val="20"/>
+              </w:rPr>
+              <w:t xml:space="preserve"> et </w:t>
+            </w:r>
+            <w:r>
+              <w:rPr>
+                <w:rFonts w:ascii="Arial" w:hAnsi="Arial" w:cs="Arial"/>
+                <w:bCs/>
+                <w:sz w:val="20"/>
+              </w:rPr>
+              <w:t>Dokuwiki</w:t>
+            </w:r>
+            <w:r>
+              <w:rPr>
+                <w:rFonts w:ascii="Arial" w:hAnsi="Arial" w:cs="Arial"/>
+                <w:bCs/>
+                <w:sz w:val="20"/>
+              </w:rPr>
+              <w:t>.</w:t>
             </w:r>
           </w:p>
           <w:p>
@@ -5129,8 +5139,46 @@
                 <w:bCs/>
                 <w:sz w:val="20"/>
               </w:rPr>
+              <w:t xml:space="preserve">Modèle du serveur : </w:t>
+            </w:r>
+            <w:r>
+              <w:rPr>
+                <w:rFonts w:ascii="Arial" w:hAnsi="Arial" w:cs="Arial"/>
+                <w:bCs/>
+                <w:sz w:val="20"/>
+              </w:rPr>
+              <w:t>Dell Inc. PowerEdge R640</w:t>
+            </w:r>
+          </w:p>
+          <w:p>
+            <w:pPr>
+              <w:snapToGrid w:val="0"/>
+              <w:jc w:val="both"/>
+              <w:rPr>
+                <w:rFonts w:ascii="Arial" w:hAnsi="Arial" w:cs="Arial"/>
+                <w:bCs/>
+                <w:sz w:val="20"/>
+              </w:rPr>
+            </w:pPr>
+            <w:r>
+              <w:rPr>
+                <w:rFonts w:ascii="Arial" w:hAnsi="Arial" w:cs="Arial"/>
+                <w:bCs/>
+                <w:sz w:val="20"/>
+              </w:rPr>
               <w:t>Switch : Cisco Catalyst 2960</w:t>
             </w:r>
+          </w:p>
+          <w:p>
+            <w:pPr>
+              <w:snapToGrid w:val="0"/>
+              <w:jc w:val="both"/>
+              <w:rPr>
+                <w:rFonts w:ascii="Arial" w:hAnsi="Arial" w:cs="Arial"/>
+                <w:bCs/>
+                <w:sz w:val="20"/>
+              </w:rPr>
+            </w:pPr>
           </w:p>
         </w:tc>
       </w:tr>
@@ -5249,13 +5297,6 @@
             <w:pPr>
               <w:snapToGrid w:val="0"/>
               <w:jc w:val="both"/>
-              <w:rPr>
-                <w:rFonts w:ascii="Arial" w:hAnsi="Arial" w:cs="Arial"/>
-                <w:b/>
-                <w:bCs/>
-                <w:sz w:val="20"/>
-                <w:szCs w:val="20"/>
-              </w:rPr>
             </w:pPr>
             <w:hyperlink r:id="rId11" w:history="1">
               <w:r>
@@ -5317,6 +5358,7 @@
                 <w:sz w:val="22"/>
                 <w:szCs w:val="22"/>
               </w:rPr>
+              <w:lastRenderedPageBreak/>
               <w:br w:type="page"/>
             </w:r>
             <w:r>
@@ -5639,13 +5681,16 @@
             </w:r>
           </w:p>
           <w:p>
+            <w:pPr>
+              <w:jc w:val="center"/>
+            </w:pPr>
             <w:r>
               <w:rPr>
                 <w:noProof/>
               </w:rPr>
               <w:drawing>
-                <wp:inline distT="0" distB="0" distL="0" distR="0" wp14:anchorId="3C51883F" wp14:editId="29B7AA65">
-                  <wp:extent cx="6294755" cy="5890260"/>
+                <wp:inline distT="0" distB="0" distL="0" distR="0" wp14:anchorId="3C51883F" wp14:editId="4C4C9E0D">
+                  <wp:extent cx="4140363" cy="3874307"/>
                   <wp:effectExtent l="0" t="0" r="0" b="0"/>
                   <wp:docPr id="1802219648" name="Image 2"/>
                   <wp:cNvGraphicFramePr>
@@ -5673,7 +5718,7 @@
                         <pic:spPr>
                           <a:xfrm>
                             <a:off x="0" y="0"/>
-                            <a:ext cx="6294755" cy="5890260"/>
+                            <a:ext cx="4176232" cy="3907871"/>
                           </a:xfrm>
                           <a:prstGeom prst="rect">
                             <a:avLst/>
@@ -5712,9 +5757,9 @@
                 <w:noProof/>
               </w:rPr>
               <w:drawing>
-                <wp:inline distT="0" distB="0" distL="0" distR="0" wp14:anchorId="3FDCFF7F" wp14:editId="3B1EDE7C">
-                  <wp:extent cx="5019675" cy="1885950"/>
-                  <wp:effectExtent l="0" t="0" r="9525" b="0"/>
+                <wp:inline distT="0" distB="0" distL="0" distR="0" wp14:anchorId="3FDCFF7F" wp14:editId="26CE5D21">
+                  <wp:extent cx="3770254" cy="1416527"/>
+                  <wp:effectExtent l="0" t="0" r="1905" b="0"/>
                   <wp:docPr id="1745954987" name="Image 2"/>
                   <wp:cNvGraphicFramePr>
                     <a:graphicFrameLocks xmlns:a="http://schemas.openxmlformats.org/drawingml/2006/main" noChangeAspect="1"/>
@@ -5741,7 +5786,7 @@
                         <pic:spPr>
                           <a:xfrm>
                             <a:off x="0" y="0"/>
-                            <a:ext cx="5019675" cy="1885950"/>
+                            <a:ext cx="3843103" cy="1443897"/>
                           </a:xfrm>
                           <a:prstGeom prst="rect">
                             <a:avLst/>
@@ -5765,7 +5810,33 @@
             <w:pPr>
               <w:snapToGrid w:val="0"/>
               <w:spacing w:line="276" w:lineRule="auto"/>
-              <w:jc w:val="center"/>
+            </w:pPr>
+            <w:r>
+              <w:t>Mise en place de Traefik comme reverse proxy. Ajout de Grafana, Prometheus et Dokuwiki via le docker-compose.yml. L’ip de la VM est 192.168.253.147 et le nom de domaine utilisé est mediaschool.local. Accès aux différentes interfaces sur le navigateur.</w:t>
+            </w:r>
+          </w:p>
+          <w:p>
+            <w:pPr>
+              <w:snapToGrid w:val="0"/>
+              <w:spacing w:line="276" w:lineRule="auto"/>
+            </w:pPr>
+          </w:p>
+          <w:p>
+            <w:pPr>
+              <w:snapToGrid w:val="0"/>
+              <w:spacing w:line="276" w:lineRule="auto"/>
+            </w:pPr>
+            <w:r>
+              <w:t>Au début je découvrais Traefik, au fur-à-mesure je devenais un peu plus à l’aise. Cela m’a permis d’installer d’autres services, sur 3 VM différentes pour commencer avec docker run, puis j’ai compris l’utilité du docker-compose et j’ai pu tout centraliser sur une seule VM.</w:t>
+            </w:r>
+            <w:r>
+              <w:t xml:space="preserve"> L’appel d’offre était plus élaboré, techniquement j’étais en difficulté avec beaucoup de notions que je ne connaissais pas.</w:t>
+            </w:r>
+          </w:p>
+          <w:p>
+            <w:pPr>
+              <w:snapToGrid w:val="0"/>
+              <w:spacing w:line="276" w:lineRule="auto"/>
             </w:pPr>
           </w:p>
           <w:p>

</xml_diff>